<commit_message>
Docs: Docker Compose and CI are now verified on GitHub Actions; add AI key checker script
Co-Authored-By: Claude Sonnet 5.5 <noreply@anthropic.com>
</commit_message>
<xml_diff>
--- a/docs/exports/04_Testing_Report.docx
+++ b/docs/exports/04_Testing_Report.docx
@@ -22083,7 +22083,7 @@
               <w:rPr>
                 <w:sz w:val="17"/>
               </w:rPr>
-              <w:t xml:space="preserve">0 unexplained hits; 205 allow-listed hits that use an unrelated sense of a word (a TARA</w:t>
+              <w:t xml:space="preserve">7 unexplained hits; 205 allow-listed hits that use an unrelated sense of a word (a TARA</w:t>
             </w:r>
             <w:r>
               <w:rPr>
@@ -22566,69 +22566,22 @@
           <w:b/>
           <w:bCs/>
         </w:rPr>
-        <w:t xml:space="preserve">Docker and Docker Compose were never run.</w:t>
+        <w:t xml:space="preserve">Docker was not run on the authors’ computers</w:t>
       </w:r>
       <w:r>
         <w:t xml:space="preserve"> </w:t>
       </w:r>
       <w:r>
-        <w:t xml:space="preserve">Docker is not installed on the development machine. The</w:t>
-      </w:r>
-      <w:r>
-        <w:t xml:space="preserve"> </w:t>
+        <w:t xml:space="preserve">(it is not installed there). The container images, the Compose stack and a scripted smoke test (</w:t>
       </w:r>
       <w:r>
         <w:rPr>
           <w:rStyle w:val="VerbatimChar"/>
         </w:rPr>
-        <w:t xml:space="preserve">Dockerfile</w:t>
-      </w:r>
-      <w:r>
-        <w:t xml:space="preserve">s,</w:t>
-      </w:r>
-      <w:r>
-        <w:t xml:space="preserve"> </w:t>
-      </w:r>
-      <w:r>
-        <w:rPr>
-          <w:rStyle w:val="VerbatimChar"/>
-        </w:rPr>
-        <w:t xml:space="preserve">docker-compose.yml</w:t>
-      </w:r>
-      <w:r>
-        <w:t xml:space="preserve"> </w:t>
-      </w:r>
-      <w:r>
-        <w:t xml:space="preserve">and Nginx configuration were written and reviewed, and every service they start was verified individually (PostgreSQL, Redis + Celery, MySQL), but the container images were</w:t>
-      </w:r>
-      <w:r>
-        <w:t xml:space="preserve"> </w:t>
-      </w:r>
-      <w:r>
-        <w:rPr>
-          <w:b/>
-          <w:bCs/>
-        </w:rPr>
-        <w:t xml:space="preserve">not built</w:t>
-      </w:r>
-      <w:r>
-        <w:t xml:space="preserve"> </w:t>
-      </w:r>
-      <w:r>
-        <w:t xml:space="preserve">and the Compose stack was</w:t>
-      </w:r>
-      <w:r>
-        <w:t xml:space="preserve"> </w:t>
-      </w:r>
-      <w:r>
-        <w:rPr>
-          <w:b/>
-          <w:bCs/>
-        </w:rPr>
-        <w:t xml:space="preserve">not started</w:t>
-      </w:r>
-      <w:r>
-        <w:t xml:space="preserve">.</w:t>
+        <w:t xml:space="preserve">scripts/compose_smoke.sh</w:t>
+      </w:r>
+      <w:r>
+        <w:t xml:space="preserve">) run on GitHub’s Linux runner instead and pass; locally each service was verified individually (PostgreSQL, Redis + Celery, MySQL). Behaviour beyond the smoke test (restarts, volume backups, version updates) was not exercised.</w:t>
       </w:r>
     </w:p>
     <w:p>
@@ -22832,7 +22785,19 @@
         <w:t xml:space="preserve">.github/workflows/ci.yml</w:t>
       </w:r>
       <w:r>
-        <w:t xml:space="preserve">) was written but never run on GitHub; the same commands were run by hand locally instead (the Docker build job in it was not run at all).</w:t>
+        <w:t xml:space="preserve">) runs on every push. Its first run exposed one date-dependent test (a Diwali-season expectation that changed when the 2026 season started); it was fixed by freezing</w:t>
+      </w:r>
+      <w:r>
+        <w:t xml:space="preserve"> </w:t>
+      </w:r>
+      <w:r>
+        <w:t xml:space="preserve">“today”</w:t>
+      </w:r>
+      <w:r>
+        <w:t xml:space="preserve"> </w:t>
+      </w:r>
+      <w:r>
+        <w:t xml:space="preserve">in the test, and all five jobs now pass.</w:t>
       </w:r>
     </w:p>
     <w:bookmarkEnd w:id="56"/>

</xml_diff>